<commit_message>
Panel: normas al 26/10/2026
</commit_message>
<xml_diff>
--- a/docs/resumenes/Normas_ElPeruano_20261026.docx
+++ b/docs/resumenes/Normas_ElPeruano_20261026.docx
@@ -23,7 +23,7 @@
         <w:br/>
       </w:r>
       <w:r>
-        <w:t>Generado: 26/10/2026 10:15  ·  Fuente: diariooficial.elperuano.pe</w:t>
+        <w:t>Generado: 26/10/2026 15:29  ·  Fuente: diariooficial.elperuano.pe</w:t>
       </w:r>
     </w:p>
     <w:p>
@@ -36,7 +36,7 @@
     </w:p>
     <w:p>
       <w:r>
-        <w:t>Se revisaron 11 normas publicadas en el periodo. 2 resultan de interés para la ATU por tratar sobre la entidad, la normatividad presupuestal o las inversiones.</w:t>
+        <w:t>Se revisaron 12 normas publicadas en el periodo. 3 resultan de interés para la ATU por tratar sobre la entidad, la normatividad presupuestal o las inversiones.</w:t>
       </w:r>
     </w:p>
     <w:tbl>
@@ -110,7 +110,7 @@
           </w:tcPr>
           <w:p>
             <w:r>
-              <w:t>0</w:t>
+              <w:t>1</w:t>
             </w:r>
           </w:p>
         </w:tc>
@@ -396,7 +396,264 @@
         <w:pStyle w:val="Heading1"/>
       </w:pPr>
       <w:r>
-        <w:t>3. Inversiones (1)</w:t>
+        <w:t>3. Normatividad presupuestal (1)</w:t>
+      </w:r>
+    </w:p>
+    <w:tbl>
+      <w:tblPr>
+        <w:tblStyle w:val="TableGrid"/>
+        <w:tblW w:type="auto" w:w="0"/>
+        <w:tblLook w:firstColumn="1" w:firstRow="1" w:lastColumn="0" w:lastRow="0" w:noHBand="0" w:noVBand="1" w:val="04A0"/>
+      </w:tblPr>
+      <w:tblGrid>
+        <w:gridCol w:w="2493"/>
+        <w:gridCol w:w="2493"/>
+        <w:gridCol w:w="2493"/>
+        <w:gridCol w:w="2493"/>
+      </w:tblGrid>
+      <w:tr>
+        <w:tc>
+          <w:tcPr>
+            <w:tcW w:type="dxa" w:w="1247"/>
+            <w:shd w:val="clear" w:color="auto" w:fill="1F4E79"/>
+          </w:tcPr>
+          <w:p>
+            <w:r>
+              <w:rPr>
+                <w:b/>
+                <w:color w:val="FFFFFF"/>
+                <w:sz w:val="18"/>
+              </w:rPr>
+              <w:t>Fecha</w:t>
+            </w:r>
+          </w:p>
+        </w:tc>
+        <w:tc>
+          <w:tcPr>
+            <w:tcW w:type="dxa" w:w="1984"/>
+            <w:shd w:val="clear" w:color="auto" w:fill="1F4E79"/>
+          </w:tcPr>
+          <w:p>
+            <w:r>
+              <w:rPr>
+                <w:b/>
+                <w:color w:val="FFFFFF"/>
+                <w:sz w:val="18"/>
+              </w:rPr>
+              <w:t>Entidad</w:t>
+            </w:r>
+          </w:p>
+        </w:tc>
+        <w:tc>
+          <w:tcPr>
+            <w:tcW w:type="dxa" w:w="2268"/>
+            <w:shd w:val="clear" w:color="auto" w:fill="1F4E79"/>
+          </w:tcPr>
+          <w:p>
+            <w:r>
+              <w:rPr>
+                <w:b/>
+                <w:color w:val="FFFFFF"/>
+                <w:sz w:val="18"/>
+              </w:rPr>
+              <w:t>Norma</w:t>
+            </w:r>
+          </w:p>
+        </w:tc>
+        <w:tc>
+          <w:tcPr>
+            <w:tcW w:type="dxa" w:w="4139"/>
+            <w:shd w:val="clear" w:color="auto" w:fill="1F4E79"/>
+          </w:tcPr>
+          <w:p>
+            <w:r>
+              <w:rPr>
+                <w:b/>
+                <w:color w:val="FFFFFF"/>
+                <w:sz w:val="18"/>
+              </w:rPr>
+              <w:t>Sumilla</w:t>
+            </w:r>
+          </w:p>
+        </w:tc>
+      </w:tr>
+      <w:tr>
+        <w:tc>
+          <w:tcPr>
+            <w:tcW w:type="dxa" w:w="1247"/>
+          </w:tcPr>
+          <w:p>
+            <w:r>
+              <w:rPr>
+                <w:sz w:val="18"/>
+              </w:rPr>
+              <w:t>25/10/2026 (Ext.)</w:t>
+            </w:r>
+          </w:p>
+        </w:tc>
+        <w:tc>
+          <w:tcPr>
+            <w:tcW w:type="dxa" w:w="1984"/>
+          </w:tcPr>
+          <w:p>
+            <w:r>
+              <w:rPr>
+                <w:sz w:val="18"/>
+              </w:rPr>
+              <w:t>SEGURO INTEGRAL DE SALUD</w:t>
+            </w:r>
+          </w:p>
+        </w:tc>
+        <w:tc>
+          <w:tcPr>
+            <w:tcW w:type="dxa" w:w="2268"/>
+          </w:tcPr>
+          <w:p>
+            <w:r>
+              <w:rPr>
+                <w:sz w:val="18"/>
+              </w:rPr>
+            </w:r>
+            <w:hyperlink r:id="rId12">
+              <w:r>
+                <w:rPr>
+                  <w:color w:val="0563C1"/>
+                  <w:u w:val="single"/>
+                </w:rPr>
+                <w:t>RESOLUCIÓN JEFATURAL N° 000166-2026-SIS/J</w:t>
+              </w:r>
+            </w:hyperlink>
+          </w:p>
+        </w:tc>
+        <w:tc>
+          <w:tcPr>
+            <w:tcW w:type="dxa" w:w="4139"/>
+          </w:tcPr>
+          <w:p>
+            <w:r>
+              <w:rPr>
+                <w:sz w:val="18"/>
+              </w:rPr>
+              <w:t>Aprueban Transferencia Financiera a favor de unidades ejecutoras para financiar prestaciones de salud y administrativas vinculadas a traslados de emergencia</w:t>
+            </w:r>
+          </w:p>
+        </w:tc>
+      </w:tr>
+    </w:tbl>
+    <w:p/>
+    <w:p>
+      <w:pPr>
+        <w:pStyle w:val="Heading3"/>
+      </w:pPr>
+      <w:r>
+        <w:t>RESOLUCIÓN JEFATURAL N° 000166-2026-SIS/J</w:t>
+      </w:r>
+    </w:p>
+    <w:p>
+      <w:r>
+        <w:rPr>
+          <w:b/>
+        </w:rPr>
+        <w:t xml:space="preserve">Entidad: </w:t>
+      </w:r>
+      <w:r>
+        <w:t xml:space="preserve">SEGURO INTEGRAL DE SALUD   </w:t>
+      </w:r>
+      <w:r>
+        <w:rPr>
+          <w:b/>
+        </w:rPr>
+        <w:t xml:space="preserve">Fecha: </w:t>
+      </w:r>
+      <w:r>
+        <w:t>25/10/2026  (Edición Extraordinaria)</w:t>
+      </w:r>
+    </w:p>
+    <w:p>
+      <w:r>
+        <w:rPr>
+          <w:b/>
+        </w:rPr>
+        <w:t xml:space="preserve">Temas: </w:t>
+      </w:r>
+      <w:r>
+        <w:t>Normatividad presupuestal</w:t>
+      </w:r>
+    </w:p>
+    <w:p>
+      <w:r>
+        <w:rPr>
+          <w:b/>
+        </w:rPr>
+        <w:t xml:space="preserve">Sumilla: </w:t>
+      </w:r>
+      <w:r>
+        <w:t>Aprueban Transferencia Financiera a favor de unidades ejecutoras para financiar prestaciones de salud y administrativas vinculadas a traslados de emergencia</w:t>
+      </w:r>
+    </w:p>
+    <w:p>
+      <w:r>
+        <w:rPr>
+          <w:b/>
+        </w:rPr>
+        <w:t xml:space="preserve">Dispone: </w:t>
+      </w:r>
+      <w:r>
+        <w:t>Artículo 1.- Aprobar la Transferencia Financiera de la Unidad Ejecutora 001-1091 Seguro Integral de Salud - SIS hasta por la suma de S/ 11,061,013.00 (ONCE MILLONES SESENTA Y UN MIL TRECE CON 00/100 SOLES), con cargo a las Fuentes de Financiamiento: Recursos Ordinarios y Recursos Directamente Recaudados, a favor de las unidades ejecutoras descritas en el Anexo N° 01 “Pliego 135 - Seguro Integral de Salud - Unidad Ejecutora 001 - 1091 Seguro Integral de Salud - Transferencia Financiera - Recursos Ordinarios - Recursos Directamente Recaudados - Octubre 2026” adjunto a la presente resolución, para financiar las prestaciones de salud y administrativas vinculadas a traslados de emergencia, en…</w:t>
+      </w:r>
+    </w:p>
+    <w:p>
+      <w:r>
+        <w:rPr>
+          <w:b/>
+        </w:rPr>
+        <w:t xml:space="preserve">Montos citados: </w:t>
+      </w:r>
+      <w:r>
+        <w:t>S/ 2, S/ 11,061,013.00, S/11,061,013.00</w:t>
+      </w:r>
+    </w:p>
+    <w:p>
+      <w:hyperlink r:id="rId12">
+        <w:r>
+          <w:rPr>
+            <w:color w:val="0563C1"/>
+            <w:u w:val="single"/>
+          </w:rPr>
+          <w:t>Ver texto completo</w:t>
+        </w:r>
+      </w:hyperlink>
+      <w:r>
+        <w:t xml:space="preserve">   </w:t>
+      </w:r>
+      <w:hyperlink r:id="rId13">
+        <w:r>
+          <w:rPr>
+            <w:color w:val="0563C1"/>
+            <w:u w:val="single"/>
+          </w:rPr>
+          <w:t>Ver en El Peruano</w:t>
+        </w:r>
+      </w:hyperlink>
+      <w:r>
+        <w:t xml:space="preserve">   </w:t>
+      </w:r>
+      <w:hyperlink r:id="rId14">
+        <w:r>
+          <w:rPr>
+            <w:color w:val="0563C1"/>
+            <w:u w:val="single"/>
+          </w:rPr>
+          <w:t>PDF</w:t>
+        </w:r>
+      </w:hyperlink>
+    </w:p>
+    <w:p>
+      <w:pPr>
+        <w:pStyle w:val="Heading1"/>
+      </w:pPr>
+      <w:r>
+        <w:t>4. Inversiones (1)</w:t>
       </w:r>
     </w:p>
     <w:tbl>
@@ -514,7 +771,7 @@
                 <w:sz w:val="18"/>
               </w:rPr>
             </w:r>
-            <w:hyperlink r:id="rId12">
+            <w:hyperlink r:id="rId15">
               <w:r>
                 <w:rPr>
                   <w:color w:val="0563C1"/>
@@ -603,7 +860,7 @@
       </w:r>
     </w:p>
     <w:p>
-      <w:hyperlink r:id="rId12">
+      <w:hyperlink r:id="rId15">
         <w:r>
           <w:rPr>
             <w:color w:val="0563C1"/>
@@ -615,7 +872,7 @@
       <w:r>
         <w:t xml:space="preserve">   </w:t>
       </w:r>
-      <w:hyperlink r:id="rId13">
+      <w:hyperlink r:id="rId16">
         <w:r>
           <w:rPr>
             <w:color w:val="0563C1"/>
@@ -627,7 +884,7 @@
       <w:r>
         <w:t xml:space="preserve">   </w:t>
       </w:r>
-      <w:hyperlink r:id="rId14">
+      <w:hyperlink r:id="rId17">
         <w:r>
           <w:rPr>
             <w:color w:val="0563C1"/>

</xml_diff>